<commit_message>
Verify literature table (step B): corrections, verified citations, paper refs v0.2
Co-Authored-By: Claude Opus 5.5 <noreply@anthropic.com>
Claude-Session: https://claude.ai/code/session_018dosMa47TqmWCCUSzcEhmw
</commit_message>
<xml_diff>
--- a/research/forecast/paper/REVIEW_PAPER_DRAFT.docx
+++ b/research/forecast/paper/REVIEW_PAPER_DRAFT.docx
@@ -203,7 +203,7 @@
         <w:t xml:space="preserve"> </w:t>
       </w:r>
       <w:r>
-        <w:t xml:space="preserve">v0.1,</w:t>
+        <w:t xml:space="preserve">v0.2,</w:t>
       </w:r>
       <w:r>
         <w:t xml:space="preserve"> </w:t>
@@ -222,6 +222,30 @@
       </w:r>
       <w:r>
         <w:t xml:space="preserve">2026</w:t>
+      </w:r>
+      <w:r>
+        <w:t xml:space="preserve"> </w:t>
+      </w:r>
+      <w:r>
+        <w:t xml:space="preserve">(references</w:t>
+      </w:r>
+      <w:r>
+        <w:t xml:space="preserve"> </w:t>
+      </w:r>
+      <w:r>
+        <w:t xml:space="preserve">verified,</w:t>
+      </w:r>
+      <w:r>
+        <w:t xml:space="preserve"> </w:t>
+      </w:r>
+      <w:r>
+        <w:t xml:space="preserve">see</w:t>
+      </w:r>
+      <w:r>
+        <w:t xml:space="preserve"> </w:t>
+      </w:r>
+      <w:r>
+        <w:t xml:space="preserve">VERIFICATION.md)</w:t>
       </w:r>
     </w:p>
     <w:p>
@@ -1354,7 +1378,7 @@
         <w:t xml:space="preserve"> </w:t>
       </w:r>
       <w:r>
-        <w:t xml:space="preserve">reports mixed results. One IEEE conference study found statistical models beating LSTM on a small CPI sample [A], and a CAFRAL study found deep networks weakest at the one-month horizon [21]</w:t>
+        <w:t xml:space="preserve">reports mixed results. One IEEE conference study found statistical models beating LSTM on a small CPI sample [A], and a CAFRAL study found that deep networks cut India’s forecast error by about 44–63% at every horizon</w:t>
       </w:r>
       <w:r>
         <w:t xml:space="preserve"> </w:t>
@@ -1364,10 +1388,13 @@
           <w:iCs/>
           <w:i/>
         </w:rPr>
-        <w:t xml:space="preserve">[A]</w:t>
-      </w:r>
-      <w:r>
-        <w:t xml:space="preserve">. Recent RBI work combines statistical, ML and deep models with performance weights [6]</w:t>
+        <w:t xml:space="preserve">except</w:t>
+      </w:r>
+      <w:r>
+        <w:t xml:space="preserve"> </w:t>
+      </w:r>
+      <w:r>
+        <w:t xml:space="preserve">one month ahead [21]</w:t>
       </w:r>
       <w:r>
         <w:t xml:space="preserve"> </w:t>
@@ -1380,6 +1407,19 @@
         <w:t xml:space="preserve">[A]</w:t>
       </w:r>
       <w:r>
+        <w:t xml:space="preserve">. Recent RBI work combines statistical, ML and deep models with performance weights [6]</w:t>
+      </w:r>
+      <w:r>
+        <w:t xml:space="preserve"> </w:t>
+      </w:r>
+      <w:r>
+        <w:rPr>
+          <w:iCs/>
+          <w:i/>
+        </w:rPr>
+        <w:t xml:space="preserve">[A]</w:t>
+      </w:r>
+      <w:r>
         <w:t xml:space="preserve">.</w:t>
       </w:r>
     </w:p>
@@ -1945,7 +1985,7 @@
         <w:t xml:space="preserve"> </w:t>
       </w:r>
       <w:r>
-        <w:t xml:space="preserve">retrieves similar historical segments (by dynamic time warping) to guide an LLM, reporting about 3% improvement.</w:t>
+        <w:t xml:space="preserve">(arXiv preprint) retrieves similar historical segments (by dynamic time warping) to guide an LLM, reporting about 3% improvement.</w:t>
       </w:r>
       <w:r>
         <w:t xml:space="preserve"> </w:t>
@@ -5562,7 +5602,7 @@
         <w:t xml:space="preserve">RBI Occasional Papers</w:t>
       </w:r>
       <w:r>
-        <w:t xml:space="preserve">, vol. 42, no. 2, 2021. [A] [verify]</w:t>
+        <w:t xml:space="preserve">, vol. 42, no. 2, 2021 (published Oct. 2022). [A]</w:t>
       </w:r>
     </w:p>
     <w:p>
@@ -5628,7 +5668,7 @@
         <w:t xml:space="preserve">Int. J. Economics and Finance</w:t>
       </w:r>
       <w:r>
-        <w:t xml:space="preserve">, vol. 16, no. 6, pp. 92–100, 2024. [A] [verify authors]</w:t>
+        <w:t xml:space="preserve">, vol. 16, no. 6, pp. 92–100, 2024, doi: 10.5539/ijef.v16n6p92. [A] [verify that the data is Indian]</w:t>
       </w:r>
     </w:p>
     <w:p>
@@ -5636,7 +5676,37 @@
         <w:pStyle w:val="BodyText"/>
       </w:pPr>
       <w:r>
-        <w:t xml:space="preserve">[6] Reserve Bank of India, article on combining statistical, ML and deep-learning models for inflation forecasting,</w:t>
+        <w:t xml:space="preserve">[6] R. Mohan, S. Hasan, S. Roy, S. Sarkar and J. John,</w:t>
+      </w:r>
+      <w:r>
+        <w:t xml:space="preserve"> </w:t>
+      </w:r>
+      <w:r>
+        <w:t xml:space="preserve">“</w:t>
+      </w:r>
+      <w:r>
+        <w:t xml:space="preserve">Predicting CPI inflation in India: Combining forecasts from a</w:t>
+      </w:r>
+      <w:r>
+        <w:t xml:space="preserve"> </w:t>
+      </w:r>
+      <w:r>
+        <w:t xml:space="preserve">‘</w:t>
+      </w:r>
+      <w:r>
+        <w:t xml:space="preserve">suite</w:t>
+      </w:r>
+      <w:r>
+        <w:t xml:space="preserve">’</w:t>
+      </w:r>
+      <w:r>
+        <w:t xml:space="preserve"> </w:t>
+      </w:r>
+      <w:r>
+        <w:t xml:space="preserve">of statistical and machine learning models,</w:t>
+      </w:r>
+      <w:r>
+        <w:t xml:space="preserve">”</w:t>
       </w:r>
       <w:r>
         <w:t xml:space="preserve"> </w:t>
@@ -5649,7 +5719,7 @@
         <w:t xml:space="preserve">RBI Bulletin</w:t>
       </w:r>
       <w:r>
-        <w:t xml:space="preserve">, Jun. 2025. [A] [verify title and authors]</w:t>
+        <w:t xml:space="preserve">, Jun. 2025. [A]</w:t>
       </w:r>
     </w:p>
     <w:p>
@@ -5936,6 +6006,32 @@
         <w:t xml:space="preserve"> </w:t>
       </w:r>
       <w:r>
+        <w:t xml:space="preserve">arXiv:2412.16643, 2024. [A] [ICASSP 2025 venue not confirmed]</w:t>
+      </w:r>
+    </w:p>
+    <w:p>
+      <w:pPr>
+        <w:pStyle w:val="BodyText"/>
+      </w:pPr>
+      <w:r>
+        <w:t xml:space="preserve">[15] X. Wang, M. Feng, J. Qiu, J. Gu and J. Zhao,</w:t>
+      </w:r>
+      <w:r>
+        <w:t xml:space="preserve"> </w:t>
+      </w:r>
+      <w:r>
+        <w:t xml:space="preserve">“</w:t>
+      </w:r>
+      <w:r>
+        <w:t xml:space="preserve">From news to forecast: Integrating event analysis in LLM-based time series forecasting with reflection,</w:t>
+      </w:r>
+      <w:r>
+        <w:t xml:space="preserve">”</w:t>
+      </w:r>
+      <w:r>
+        <w:t xml:space="preserve"> </w:t>
+      </w:r>
+      <w:r>
         <w:t xml:space="preserve">in</w:t>
       </w:r>
       <w:r>
@@ -5946,10 +6042,10 @@
           <w:iCs/>
           <w:i/>
         </w:rPr>
-        <w:t xml:space="preserve">Proc. IEEE ICASSP</w:t>
-      </w:r>
-      <w:r>
-        <w:t xml:space="preserve">, 2025. [A] [verify authors]</w:t>
+        <w:t xml:space="preserve">Advances in Neural Information Processing Systems (NeurIPS)</w:t>
+      </w:r>
+      <w:r>
+        <w:t xml:space="preserve">, 2024. [A]</w:t>
       </w:r>
     </w:p>
     <w:p>
@@ -5957,7 +6053,7 @@
         <w:pStyle w:val="BodyText"/>
       </w:pPr>
       <w:r>
-        <w:t xml:space="preserve">[15] X. Wang, M. Feng, J. Qiu, J. Gu and J. Zhao,</w:t>
+        <w:t xml:space="preserve">[16] Alam, Boyle, Li and Sekhposyan,</w:t>
       </w:r>
       <w:r>
         <w:t xml:space="preserve"> </w:t>
@@ -5966,7 +6062,7 @@
         <w:t xml:space="preserve">“</w:t>
       </w:r>
       <w:r>
-        <w:t xml:space="preserve">From news to forecast: Integrating event analysis in LLM-based time series forecasting with reflection,</w:t>
+        <w:t xml:space="preserve">ChatMacro: Evaluating inflation forecasts of generative AI,</w:t>
       </w:r>
       <w:r>
         <w:t xml:space="preserve">”</w:t>
@@ -5975,7 +6071,172 @@
         <w:t xml:space="preserve"> </w:t>
       </w:r>
       <w:r>
-        <w:t xml:space="preserve">in</w:t>
+        <w:t xml:space="preserve">Federal Reserve Bank of San Francisco, Working Paper 2026-04, 2026. [A] [verify first names]</w:t>
+      </w:r>
+    </w:p>
+    <w:p>
+      <w:pPr>
+        <w:pStyle w:val="BodyText"/>
+      </w:pPr>
+      <w:r>
+        <w:t xml:space="preserve">[17] M.-A. Allard, P. Teiletche and A. Zinebi,</w:t>
+      </w:r>
+      <w:r>
+        <w:t xml:space="preserve"> </w:t>
+      </w:r>
+      <w:r>
+        <w:t xml:space="preserve">“</w:t>
+      </w:r>
+      <w:r>
+        <w:t xml:space="preserve">Enhancing inflation nowcasting with LLM: Sentiment analysis on news,</w:t>
+      </w:r>
+      <w:r>
+        <w:t xml:space="preserve">”</w:t>
+      </w:r>
+      <w:r>
+        <w:t xml:space="preserve"> </w:t>
+      </w:r>
+      <w:r>
+        <w:t xml:space="preserve">arXiv:2410.20198, 2024. [A]</w:t>
+      </w:r>
+    </w:p>
+    <w:p>
+      <w:pPr>
+        <w:pStyle w:val="BodyText"/>
+      </w:pPr>
+      <w:r>
+        <w:t xml:space="preserve">[18] T. Tawichsri, S. Tuarob, N. Nookhwun and C. Sangasaeng,</w:t>
+      </w:r>
+      <w:r>
+        <w:t xml:space="preserve"> </w:t>
+      </w:r>
+      <w:r>
+        <w:t xml:space="preserve">“</w:t>
+      </w:r>
+      <w:r>
+        <w:t xml:space="preserve">News-based inflation expectations: LLM-assisted measurement and forecasting,</w:t>
+      </w:r>
+      <w:r>
+        <w:t xml:space="preserve">”</w:t>
+      </w:r>
+      <w:r>
+        <w:t xml:space="preserve"> </w:t>
+      </w:r>
+      <w:r>
+        <w:t xml:space="preserve">PIER Discussion Paper No. 252, Puey Ungphakorn Institute for Economic Research, May 2026. [A]</w:t>
+      </w:r>
+    </w:p>
+    <w:p>
+      <w:pPr>
+        <w:pStyle w:val="BodyText"/>
+      </w:pPr>
+      <w:r>
+        <w:t xml:space="preserve">[19] Z. Gao, W. Jiang and Y. Yan,</w:t>
+      </w:r>
+      <w:r>
+        <w:t xml:space="preserve"> </w:t>
+      </w:r>
+      <w:r>
+        <w:t xml:space="preserve">“</w:t>
+      </w:r>
+      <w:r>
+        <w:t xml:space="preserve">A test of lookahead bias in LLM forecasts</w:t>
+      </w:r>
+      <w:r>
+        <w:t xml:space="preserve">”</w:t>
+      </w:r>
+      <w:r>
+        <w:t xml:space="preserve"> </w:t>
+      </w:r>
+      <w:r>
+        <w:t xml:space="preserve">(later</w:t>
+      </w:r>
+      <w:r>
+        <w:t xml:space="preserve"> </w:t>
+      </w:r>
+      <w:r>
+        <w:t xml:space="preserve">“</w:t>
+      </w:r>
+      <w:r>
+        <w:t xml:space="preserve">Detecting lookahead bias in LLM forecasts</w:t>
+      </w:r>
+      <w:r>
+        <w:t xml:space="preserve">”</w:t>
+      </w:r>
+      <w:r>
+        <w:t xml:space="preserve">), arXiv:2512.23847, 2025. [A]</w:t>
+      </w:r>
+    </w:p>
+    <w:p>
+      <w:pPr>
+        <w:pStyle w:val="BodyText"/>
+      </w:pPr>
+      <w:r>
+        <w:t xml:space="preserve">[20] S. He, L. Lv, A. Manela and J. Wu,</w:t>
+      </w:r>
+      <w:r>
+        <w:t xml:space="preserve"> </w:t>
+      </w:r>
+      <w:r>
+        <w:t xml:space="preserve">“</w:t>
+      </w:r>
+      <w:r>
+        <w:t xml:space="preserve">Chronologically consistent large language models,</w:t>
+      </w:r>
+      <w:r>
+        <w:t xml:space="preserve">”</w:t>
+      </w:r>
+      <w:r>
+        <w:t xml:space="preserve"> </w:t>
+      </w:r>
+      <w:r>
+        <w:t xml:space="preserve">arXiv:2502.21206, 2025. [A]</w:t>
+      </w:r>
+    </w:p>
+    <w:p>
+      <w:pPr>
+        <w:pStyle w:val="BodyText"/>
+      </w:pPr>
+      <w:r>
+        <w:t xml:space="preserve">[21] K. Mahajan and A. Srinivasan,</w:t>
+      </w:r>
+      <w:r>
+        <w:t xml:space="preserve"> </w:t>
+      </w:r>
+      <w:r>
+        <w:t xml:space="preserve">“</w:t>
+      </w:r>
+      <w:r>
+        <w:t xml:space="preserve">Inflation forecasting in emerging markets: A machine learning approach,</w:t>
+      </w:r>
+      <w:r>
+        <w:t xml:space="preserve">”</w:t>
+      </w:r>
+      <w:r>
+        <w:t xml:space="preserve"> </w:t>
+      </w:r>
+      <w:r>
+        <w:t xml:space="preserve">CAFRAL, 2019/2020. [A]</w:t>
+      </w:r>
+    </w:p>
+    <w:p>
+      <w:pPr>
+        <w:pStyle w:val="BodyText"/>
+      </w:pPr>
+      <w:r>
+        <w:t xml:space="preserve">[22] M. O’Connor, W. Remus and K. Griggs,</w:t>
+      </w:r>
+      <w:r>
+        <w:t xml:space="preserve"> </w:t>
+      </w:r>
+      <w:r>
+        <w:t xml:space="preserve">“</w:t>
+      </w:r>
+      <w:r>
+        <w:t xml:space="preserve">Does updating judgmental forecasts improve forecast accuracy?</w:t>
+      </w:r>
+      <w:r>
+        <w:t xml:space="preserve">”</w:t>
       </w:r>
       <w:r>
         <w:t xml:space="preserve"> </w:t>
@@ -5985,10 +6246,10 @@
           <w:iCs/>
           <w:i/>
         </w:rPr>
-        <w:t xml:space="preserve">Advances in Neural Information Processing Systems (NeurIPS)</w:t>
-      </w:r>
-      <w:r>
-        <w:t xml:space="preserve">, 2024. [A]</w:t>
+        <w:t xml:space="preserve">Int. J. Forecasting</w:t>
+      </w:r>
+      <w:r>
+        <w:t xml:space="preserve">, vol. 16, no. 1, pp. 101–109, 2000. [A]</w:t>
       </w:r>
     </w:p>
     <w:p>
@@ -5996,7 +6257,7 @@
         <w:pStyle w:val="BodyText"/>
       </w:pPr>
       <w:r>
-        <w:t xml:space="preserve">[16] Alam, Boyle, Li and Sekhposyan,</w:t>
+        <w:t xml:space="preserve">[23] C. Ma, G. Pomazkin, G. P. Saggese and P. Smith,</w:t>
       </w:r>
       <w:r>
         <w:t xml:space="preserve"> </w:t>
@@ -6005,7 +6266,7 @@
         <w:t xml:space="preserve">“</w:t>
       </w:r>
       <w:r>
-        <w:t xml:space="preserve">ChatMacro: Evaluating inflation forecasts of generative AI,</w:t>
+        <w:t xml:space="preserve">Beyond accuracy: A stability-aware metric for multi-horizon forecasting,</w:t>
       </w:r>
       <w:r>
         <w:t xml:space="preserve">”</w:t>
@@ -6014,7 +6275,7 @@
         <w:t xml:space="preserve"> </w:t>
       </w:r>
       <w:r>
-        <w:t xml:space="preserve">Federal Reserve Bank of San Francisco, Working Paper 2026-04, 2026. [A] [verify first names]</w:t>
+        <w:t xml:space="preserve">arXiv:2601.10863, 2026. [A]</w:t>
       </w:r>
     </w:p>
     <w:p>
@@ -6022,7 +6283,7 @@
         <w:pStyle w:val="BodyText"/>
       </w:pPr>
       <w:r>
-        <w:t xml:space="preserve">[17] Allard, Teiletche and Zinebi,</w:t>
+        <w:t xml:space="preserve">[24] F. X. Diebold and R. S. Mariano,</w:t>
       </w:r>
       <w:r>
         <w:t xml:space="preserve"> </w:t>
@@ -6031,110 +6292,10 @@
         <w:t xml:space="preserve">“</w:t>
       </w:r>
       <w:r>
-        <w:t xml:space="preserve">Enhancing inflation nowcasting with LLM: Sentiment analysis on news,</w:t>
+        <w:t xml:space="preserve">Comparing predictive accuracy,</w:t>
       </w:r>
       <w:r>
         <w:t xml:space="preserve">”</w:t>
-      </w:r>
-      <w:r>
-        <w:t xml:space="preserve"> </w:t>
-      </w:r>
-      <w:r>
-        <w:t xml:space="preserve">arXiv:2410.20198, 2024. [A] [verify first names]</w:t>
-      </w:r>
-    </w:p>
-    <w:p>
-      <w:pPr>
-        <w:pStyle w:val="BodyText"/>
-      </w:pPr>
-      <w:r>
-        <w:t xml:space="preserve">[18] Puey Ungphakorn Institute for Economic Research,</w:t>
-      </w:r>
-      <w:r>
-        <w:t xml:space="preserve"> </w:t>
-      </w:r>
-      <w:r>
-        <w:t xml:space="preserve">“</w:t>
-      </w:r>
-      <w:r>
-        <w:t xml:space="preserve">News-based inflation expectations: LLM-assisted measurement and forecasting,</w:t>
-      </w:r>
-      <w:r>
-        <w:t xml:space="preserve">”</w:t>
-      </w:r>
-      <w:r>
-        <w:t xml:space="preserve"> </w:t>
-      </w:r>
-      <w:r>
-        <w:t xml:space="preserve">PIER Discussion Paper No. 252, 2026. [A] [verify authors]</w:t>
-      </w:r>
-    </w:p>
-    <w:p>
-      <w:pPr>
-        <w:pStyle w:val="BodyText"/>
-      </w:pPr>
-      <w:r>
-        <w:t xml:space="preserve">[19] Gao, Jiang and Yan,</w:t>
-      </w:r>
-      <w:r>
-        <w:t xml:space="preserve"> </w:t>
-      </w:r>
-      <w:r>
-        <w:t xml:space="preserve">“</w:t>
-      </w:r>
-      <w:r>
-        <w:t xml:space="preserve">A test of lookahead bias in LLM forecasts,</w:t>
-      </w:r>
-      <w:r>
-        <w:t xml:space="preserve">”</w:t>
-      </w:r>
-      <w:r>
-        <w:t xml:space="preserve"> </w:t>
-      </w:r>
-      <w:r>
-        <w:t xml:space="preserve">arXiv:2512.23847, 2025. [A] [verify first names]</w:t>
-      </w:r>
-    </w:p>
-    <w:p>
-      <w:pPr>
-        <w:pStyle w:val="BodyText"/>
-      </w:pPr>
-      <w:r>
-        <w:t xml:space="preserve">[20]</w:t>
-      </w:r>
-      <w:r>
-        <w:t xml:space="preserve"> </w:t>
-      </w:r>
-      <w:r>
-        <w:t xml:space="preserve">“</w:t>
-      </w:r>
-      <w:r>
-        <w:t xml:space="preserve">Chronologically consistent large language models,</w:t>
-      </w:r>
-      <w:r>
-        <w:t xml:space="preserve">”</w:t>
-      </w:r>
-      <w:r>
-        <w:t xml:space="preserve"> </w:t>
-      </w:r>
-      <w:r>
-        <w:t xml:space="preserve">arXiv:2502.21206, 2025. [A] [verify authors]</w:t>
-      </w:r>
-    </w:p>
-    <w:p>
-      <w:pPr>
-        <w:pStyle w:val="BodyText"/>
-      </w:pPr>
-      <w:r>
-        <w:t xml:space="preserve">[21] Mahajan and Srinivasan, study of deep learning for inflation forecasting in emerging markets, CAFRAL, 2019. [A] [verify title]</w:t>
-      </w:r>
-    </w:p>
-    <w:p>
-      <w:pPr>
-        <w:pStyle w:val="BodyText"/>
-      </w:pPr>
-      <w:r>
-        <w:t xml:space="preserve">[22] Study on updating forecasts with new data,</w:t>
       </w:r>
       <w:r>
         <w:t xml:space="preserve"> </w:t>
@@ -6144,10 +6305,10 @@
           <w:iCs/>
           <w:i/>
         </w:rPr>
-        <w:t xml:space="preserve">Int. J. Forecasting</w:t>
-      </w:r>
-      <w:r>
-        <w:t xml:space="preserve">, 2000. [A] [verify full reference]</w:t>
+        <w:t xml:space="preserve">J. Business &amp; Economic Statistics</w:t>
+      </w:r>
+      <w:r>
+        <w:t xml:space="preserve">, vol. 13, no. 3, pp. 253–263, 1995.</w:t>
       </w:r>
     </w:p>
     <w:p>
@@ -6155,7 +6316,7 @@
         <w:pStyle w:val="BodyText"/>
       </w:pPr>
       <w:r>
-        <w:t xml:space="preserve">[23]</w:t>
+        <w:t xml:space="preserve">[25] E. Karger, H. Bastani, C. Yueh-Han, Z. Jacobs, D. Halawi, F. Zhang and P. E. Tetlock,</w:t>
       </w:r>
       <w:r>
         <w:t xml:space="preserve"> </w:t>
@@ -6164,7 +6325,7 @@
         <w:t xml:space="preserve">“</w:t>
       </w:r>
       <w:r>
-        <w:t xml:space="preserve">Beyond accuracy: A stability-aware metric for multi-horizon forecasting,</w:t>
+        <w:t xml:space="preserve">ForecastBench: A dynamic benchmark of AI forecasting capabilities,</w:t>
       </w:r>
       <w:r>
         <w:t xml:space="preserve">”</w:t>
@@ -6173,27 +6334,7 @@
         <w:t xml:space="preserve"> </w:t>
       </w:r>
       <w:r>
-        <w:t xml:space="preserve">arXiv:2601.10863, 2026. [A] [verify authors]</w:t>
-      </w:r>
-    </w:p>
-    <w:p>
-      <w:pPr>
-        <w:pStyle w:val="BodyText"/>
-      </w:pPr>
-      <w:r>
-        <w:t xml:space="preserve">[24] F. X. Diebold and R. S. Mariano,</w:t>
-      </w:r>
-      <w:r>
-        <w:t xml:space="preserve"> </w:t>
-      </w:r>
-      <w:r>
-        <w:t xml:space="preserve">“</w:t>
-      </w:r>
-      <w:r>
-        <w:t xml:space="preserve">Comparing predictive accuracy,</w:t>
-      </w:r>
-      <w:r>
-        <w:t xml:space="preserve">”</w:t>
+        <w:t xml:space="preserve">in</w:t>
       </w:r>
       <w:r>
         <w:t xml:space="preserve"> </w:t>
@@ -6203,49 +6344,10 @@
           <w:iCs/>
           <w:i/>
         </w:rPr>
-        <w:t xml:space="preserve">J. Business &amp; Economic Statistics</w:t>
-      </w:r>
-      <w:r>
-        <w:t xml:space="preserve">, vol. 13, no. 3, pp. 253–263, 1995.</w:t>
-      </w:r>
-    </w:p>
-    <w:p>
-      <w:pPr>
-        <w:pStyle w:val="BodyText"/>
-      </w:pPr>
-      <w:r>
-        <w:t xml:space="preserve">[25] E. Karger et al.,</w:t>
-      </w:r>
-      <w:r>
-        <w:t xml:space="preserve"> </w:t>
-      </w:r>
-      <w:r>
-        <w:t xml:space="preserve">“</w:t>
-      </w:r>
-      <w:r>
-        <w:t xml:space="preserve">ForecastBench: A dynamic benchmark of AI forecasting capabilities,</w:t>
-      </w:r>
-      <w:r>
-        <w:t xml:space="preserve">”</w:t>
-      </w:r>
-      <w:r>
-        <w:t xml:space="preserve"> </w:t>
-      </w:r>
-      <w:r>
-        <w:t xml:space="preserve">in</w:t>
-      </w:r>
-      <w:r>
-        <w:t xml:space="preserve"> </w:t>
-      </w:r>
-      <w:r>
-        <w:rPr>
-          <w:iCs/>
-          <w:i/>
-        </w:rPr>
-        <w:t xml:space="preserve">Proc. Int. Conf. Learning Representations (ICLR)</w:t>
-      </w:r>
-      <w:r>
-        <w:t xml:space="preserve">, 2025. [A] [verify]</w:t>
+        <w:t xml:space="preserve">Proc. ICLR</w:t>
+      </w:r>
+      <w:r>
+        <w:t xml:space="preserve">, 2025. [A]</w:t>
       </w:r>
     </w:p>
     <w:p>

</xml_diff>